<commit_message>
Remove WhisperBox from portfolio and resume
</commit_message>
<xml_diff>
--- a/static/Julius_Chizaram_Resume.docx
+++ b/static/Julius_Chizaram_Resume.docx
@@ -560,42 +560,6 @@
           <w:b/>
           <w:sz w:val="24"/>
         </w:rPr>
-        <w:t>- WhisperBox E2EE Client: privacy-centered encrypted messaging interface with careful attention to security-focused UX.</w:t>
-      </w:r>
-    </w:p>
-    <w:p>
-      <w:pPr>
-        <w:spacing w:after="120"/>
-      </w:pPr>
-      <w:r>
-        <w:rPr>
-          <w:b/>
-          <w:sz w:val="24"/>
-        </w:rPr>
-        <w:t>  Live: https://whisperbox-e2ee-client.netlify.app/</w:t>
-      </w:r>
-    </w:p>
-    <w:p>
-      <w:pPr>
-        <w:spacing w:after="120"/>
-      </w:pPr>
-      <w:r>
-        <w:rPr>
-          <w:b/>
-          <w:sz w:val="24"/>
-        </w:rPr>
-        <w:t>  GitHub: https://github.com/Chizaram-Julius/whisperbox-e2ee-client</w:t>
-      </w:r>
-    </w:p>
-    <w:p>
-      <w:pPr>
-        <w:spacing w:after="120"/>
-      </w:pPr>
-      <w:r>
-        <w:rPr>
-          <w:b/>
-          <w:sz w:val="24"/>
-        </w:rPr>
         <w:t>For a full list of my projects, visit my GitHub: https://github.com/chizaram-julius</w:t>
       </w:r>
     </w:p>

</xml_diff>